<commit_message>
docs(capstone): actualizar Gantt 2.3, UML 1.3 y guia 1.1
</commit_message>
<xml_diff>
--- a/Fase 2/Evidencias Proyecto/Evidencias de documentación/Diagramas_UML_y_Tarjetas_CRC_seb.acevedoa_mart.espinozam_je.fernandezm_Aprueba_ModuloPreguntas.docx
+++ b/Fase 2/Evidencias Proyecto/Evidencias de documentación/Diagramas_UML_y_Tarjetas_CRC_seb.acevedoa_mart.espinozam_je.fernandezm_Aprueba_ModuloPreguntas.docx
@@ -13,12 +13,12 @@
           <wp:inline distB="0" distT="0" distL="0" distR="0">
             <wp:extent cx="1619250" cy="400050"/>
             <wp:effectExtent b="0" l="0" r="0" t="0"/>
-            <wp:docPr id="11" name="image2.jpg"/>
+            <wp:docPr id="17" name="image6.jpg"/>
             <a:graphic>
               <a:graphicData uri="http://schemas.openxmlformats.org/drawingml/2006/picture">
                 <pic:pic>
                   <pic:nvPicPr>
-                    <pic:cNvPr id="0" name="image2.jpg"/>
+                    <pic:cNvPr id="0" name="image6.jpg"/>
                     <pic:cNvPicPr preferRelativeResize="0"/>
                   </pic:nvPicPr>
                   <pic:blipFill>
@@ -632,7 +632,7 @@
                 <w:szCs w:val="19"/>
                 <w:rtl w:val="0"/>
               </w:rPr>
-              <w:t xml:space="preserve">15 de octubre de 2026</w:t>
+              <w:t xml:space="preserve">18 de octubre de 2026</w:t>
             </w:r>
             <w:r>
               <w:rPr>
@@ -748,20 +748,20 @@
           <wp:anchor allowOverlap="1" behindDoc="0" distB="0" distT="0" distL="0" distR="0" hidden="0" layoutInCell="1" locked="0" relativeHeight="0" simplePos="0">
             <wp:simplePos x="0" y="0"/>
             <wp:positionH relativeFrom="column">
-              <wp:posOffset>-1153477</wp:posOffset>
+              <wp:posOffset>-1153476</wp:posOffset>
             </wp:positionH>
             <wp:positionV relativeFrom="paragraph">
-              <wp:posOffset>157836</wp:posOffset>
+              <wp:posOffset>157835</wp:posOffset>
             </wp:positionV>
             <wp:extent cx="8173402" cy="4842789"/>
             <wp:effectExtent b="0" l="0" r="0" t="0"/>
             <wp:wrapSquare wrapText="bothSides" distB="0" distT="0" distL="0" distR="0"/>
-            <wp:docPr id="9" name="image6.png"/>
+            <wp:docPr id="16" name="image3.png"/>
             <a:graphic>
               <a:graphicData uri="http://schemas.openxmlformats.org/drawingml/2006/picture">
                 <pic:pic>
                   <pic:nvPicPr>
-                    <pic:cNvPr id="0" name="image6.png"/>
+                    <pic:cNvPr id="0" name="image3.png"/>
                     <pic:cNvPicPr preferRelativeResize="0"/>
                   </pic:nvPicPr>
                   <pic:blipFill>
@@ -2407,7 +2407,7 @@
                 <w:szCs w:val="16"/>
                 <w:rtl w:val="0"/>
               </w:rPr>
-              <w:t xml:space="preserve">En curso</w:t>
+              <w:t xml:space="preserve">Implementado y aceptado</w:t>
             </w:r>
             <w:r>
               <w:rPr>
@@ -3243,7 +3243,7 @@
           <wp:anchor allowOverlap="1" behindDoc="0" distB="0" distT="0" distL="0" distR="0" hidden="0" layoutInCell="1" locked="0" relativeHeight="0" simplePos="0">
             <wp:simplePos x="0" y="0"/>
             <wp:positionH relativeFrom="column">
-              <wp:posOffset>-819149</wp:posOffset>
+              <wp:posOffset>-819148</wp:posOffset>
             </wp:positionH>
             <wp:positionV relativeFrom="paragraph">
               <wp:posOffset>19050</wp:posOffset>
@@ -3251,12 +3251,12 @@
             <wp:extent cx="7714298" cy="5246500"/>
             <wp:effectExtent b="0" l="0" r="0" t="0"/>
             <wp:wrapSquare wrapText="bothSides" distB="0" distT="0" distL="0" distR="0"/>
-            <wp:docPr id="7" name="image5.png"/>
+            <wp:docPr id="15" name="image4.png"/>
             <a:graphic>
               <a:graphicData uri="http://schemas.openxmlformats.org/drawingml/2006/picture">
                 <pic:pic>
                   <pic:nvPicPr>
-                    <pic:cNvPr id="0" name="image5.png"/>
+                    <pic:cNvPr id="0" name="image4.png"/>
                     <pic:cNvPicPr preferRelativeResize="0"/>
                   </pic:nvPicPr>
                   <pic:blipFill>
@@ -3312,12 +3312,12 @@
           <wp:inline distB="114300" distT="114300" distL="114300" distR="114300">
             <wp:extent cx="6681663" cy="7114223"/>
             <wp:effectExtent b="0" l="0" r="0" t="0"/>
-            <wp:docPr id="8" name="image1.png"/>
+            <wp:docPr id="18" name="image5.png"/>
             <a:graphic>
               <a:graphicData uri="http://schemas.openxmlformats.org/drawingml/2006/picture">
                 <pic:pic>
                   <pic:nvPicPr>
-                    <pic:cNvPr id="0" name="image1.png"/>
+                    <pic:cNvPr id="0" name="image5.png"/>
                     <pic:cNvPicPr preferRelativeResize="0"/>
                   </pic:nvPicPr>
                   <pic:blipFill>
@@ -3464,7 +3464,7 @@
           <wp:anchor allowOverlap="1" behindDoc="0" distB="0" distT="0" distL="0" distR="0" hidden="0" layoutInCell="1" locked="0" relativeHeight="0" simplePos="0">
             <wp:simplePos x="0" y="0"/>
             <wp:positionH relativeFrom="column">
-              <wp:posOffset>-847724</wp:posOffset>
+              <wp:posOffset>-847723</wp:posOffset>
             </wp:positionH>
             <wp:positionV relativeFrom="paragraph">
               <wp:posOffset>19050</wp:posOffset>
@@ -3472,12 +3472,12 @@
             <wp:extent cx="8028303" cy="6678844"/>
             <wp:effectExtent b="0" l="0" r="0" t="0"/>
             <wp:wrapSquare wrapText="bothSides" distB="0" distT="0" distL="0" distR="0"/>
-            <wp:docPr id="10" name="image4.png"/>
+            <wp:docPr id="13" name="image1.png"/>
             <a:graphic>
               <a:graphicData uri="http://schemas.openxmlformats.org/drawingml/2006/picture">
                 <pic:pic>
                   <pic:nvPicPr>
-                    <pic:cNvPr id="0" name="image4.png"/>
+                    <pic:cNvPr id="0" name="image1.png"/>
                     <pic:cNvPicPr preferRelativeResize="0"/>
                   </pic:nvPicPr>
                   <pic:blipFill>
@@ -3606,7 +3606,7 @@
           <wp:anchor allowOverlap="1" behindDoc="0" distB="0" distT="0" distL="0" distR="0" hidden="0" layoutInCell="1" locked="0" relativeHeight="0" simplePos="0">
             <wp:simplePos x="0" y="0"/>
             <wp:positionH relativeFrom="column">
-              <wp:posOffset>-933449</wp:posOffset>
+              <wp:posOffset>-933447</wp:posOffset>
             </wp:positionH>
             <wp:positionV relativeFrom="paragraph">
               <wp:posOffset>9525</wp:posOffset>
@@ -3614,12 +3614,12 @@
             <wp:extent cx="7870843" cy="4812124"/>
             <wp:effectExtent b="0" l="0" r="0" t="0"/>
             <wp:wrapSquare wrapText="bothSides" distB="0" distT="0" distL="0" distR="0"/>
-            <wp:docPr id="12" name="image3.png"/>
+            <wp:docPr id="14" name="image2.png"/>
             <a:graphic>
               <a:graphicData uri="http://schemas.openxmlformats.org/drawingml/2006/picture">
                 <pic:pic>
                   <pic:nvPicPr>
-                    <pic:cNvPr id="0" name="image3.png"/>
+                    <pic:cNvPr id="0" name="image2.png"/>
                     <pic:cNvPicPr preferRelativeResize="0"/>
                   </pic:nvPicPr>
                   <pic:blipFill>
@@ -3681,7 +3681,7 @@
           <w:szCs w:val="22"/>
           <w:rtl w:val="0"/>
         </w:rPr>
-        <w:t xml:space="preserve">Cada tarjeta indica la clase, sus responsabilidades y las clases con que colabora para cumplirlas. Se incluyen las clases del dominio, de servicio y de las pantallas que concentran las reglas de negocio del módulo, incluidas las de la habilidad evaluada, en desarrollo en la iteración 6.</w:t>
+        <w:t xml:space="preserve">Cada tarjeta indica la clase, sus responsabilidades y las clases con que colabora para cumplirlas. Se incluyen las clases del dominio, de servicio y de las pantallas que concentran las reglas de negocio del módulo, incluidas las de la habilidad evaluada, implementada y aceptada en la iteración 6.</w:t>
       </w:r>
       <w:r>
         <w:rPr>
@@ -9078,6 +9078,88 @@
                 <w:szCs w:val="17"/>
                 <w:rtl w:val="0"/>
               </w:rPr>
+              <w:t xml:space="preserve">Conservar la pantalla al recargar, a partir del identificador de la pregunta en la dirección</w:t>
+            </w:r>
+            <w:r>
+              <w:rPr>
+                <w:rtl w:val="0"/>
+              </w:rPr>
+            </w:r>
+          </w:p>
+        </w:tc>
+        <w:tc>
+          <w:tcPr>
+            <w:tcBorders>
+              <w:top w:color="808080" w:space="0" w:sz="4" w:val="single"/>
+              <w:left w:color="808080" w:space="0" w:sz="4" w:val="single"/>
+              <w:bottom w:color="808080" w:space="0" w:sz="4" w:val="single"/>
+              <w:right w:color="808080" w:space="0" w:sz="4" w:val="single"/>
+            </w:tcBorders>
+            <w:tcMar>
+              <w:top w:w="60.0" w:type="dxa"/>
+              <w:left w:w="90.0" w:type="dxa"/>
+              <w:bottom w:w="60.0" w:type="dxa"/>
+              <w:right w:w="90.0" w:type="dxa"/>
+            </w:tcMar>
+          </w:tcPr>
+          <w:p>
+            <w:pPr>
+              <w:jc w:val="left"/>
+              <w:rPr/>
+            </w:pPr>
+            <w:r>
+              <w:rPr>
+                <w:rFonts w:ascii="Calibri" w:cs="Calibri" w:eastAsia="Calibri" w:hAnsi="Calibri"/>
+                <w:b w:val="0"/>
+                <w:bCs w:val="0"/>
+                <w:sz w:val="17"/>
+                <w:szCs w:val="17"/>
+                <w:rtl w:val="0"/>
+              </w:rPr>
+              <w:t xml:space="preserve">RepositorioPractica</w:t>
+            </w:r>
+            <w:r>
+              <w:rPr>
+                <w:rtl w:val="0"/>
+              </w:rPr>
+            </w:r>
+          </w:p>
+        </w:tc>
+      </w:tr>
+      <w:tr>
+        <w:trPr>
+          <w:cantSplit w:val="0"/>
+          <w:tblHeader w:val="0"/>
+        </w:trPr>
+        <w:tc>
+          <w:tcPr>
+            <w:tcBorders>
+              <w:top w:color="808080" w:space="0" w:sz="4" w:val="single"/>
+              <w:left w:color="808080" w:space="0" w:sz="4" w:val="single"/>
+              <w:bottom w:color="808080" w:space="0" w:sz="4" w:val="single"/>
+              <w:right w:color="808080" w:space="0" w:sz="4" w:val="single"/>
+            </w:tcBorders>
+            <w:tcMar>
+              <w:top w:w="60.0" w:type="dxa"/>
+              <w:left w:w="90.0" w:type="dxa"/>
+              <w:bottom w:w="60.0" w:type="dxa"/>
+              <w:right w:w="90.0" w:type="dxa"/>
+            </w:tcMar>
+          </w:tcPr>
+          <w:p>
+            <w:pPr>
+              <w:jc w:val="left"/>
+              <w:rPr/>
+            </w:pPr>
+            <w:r>
+              <w:rPr>
+                <w:rFonts w:ascii="Calibri" w:cs="Calibri" w:eastAsia="Calibri" w:hAnsi="Calibri"/>
+                <w:b w:val="0"/>
+                <w:bCs w:val="0"/>
+                <w:sz w:val="17"/>
+                <w:szCs w:val="17"/>
+                <w:rtl w:val="0"/>
+              </w:rPr>
               <w:t xml:space="preserve">Informar cuando la habilidad no está disponible</w:t>
             </w:r>
             <w:r>
@@ -9155,7 +9237,11 @@
       <w:pPr>
         <w:spacing w:after="120" w:line="276" w:lineRule="auto"/>
         <w:jc w:val="both"/>
-        <w:rPr/>
+        <w:rPr>
+          <w:rFonts w:ascii="Calibri" w:cs="Calibri" w:eastAsia="Calibri" w:hAnsi="Calibri"/>
+          <w:sz w:val="22"/>
+          <w:szCs w:val="22"/>
+        </w:rPr>
       </w:pPr>
       <w:r>
         <w:rPr>
@@ -9166,6 +9252,13 @@
         </w:rPr>
         <w:t xml:space="preserve">Se utilizó Claude (Anthropic, 2026) como apoyo en la redacción y estructuración de este documento, a partir de la información del proyecto aportada por el equipo. El contenido fue revisado y validado por los integrantes antes de su entrega.</w:t>
       </w:r>
+    </w:p>
+    <w:p>
+      <w:pPr>
+        <w:spacing w:after="120" w:line="276" w:lineRule="auto"/>
+        <w:jc w:val="both"/>
+        <w:rPr/>
+      </w:pPr>
       <w:r>
         <w:rPr>
           <w:rtl w:val="0"/>
@@ -9933,6 +10026,126 @@
                 <w:rtl w:val="0"/>
               </w:rPr>
               <w:t xml:space="preserve">Casos de uso CU-01, CU-02 y CU-06 actualizados a implementados y aceptados, y CU-07 en curso. Se agregan las tarjetas CRC de la habilidad evaluada, la explicación detallada y las pantallas Resultado, Explicación detallada y Habilidad evaluada, y se completan las de ServicioPractica y ServicioRespuesta con las reglas de la iteración 6.</w:t>
+            </w:r>
+            <w:r>
+              <w:rPr>
+                <w:rtl w:val="0"/>
+              </w:rPr>
+            </w:r>
+          </w:p>
+        </w:tc>
+      </w:tr>
+      <w:tr>
+        <w:trPr>
+          <w:cantSplit w:val="0"/>
+          <w:tblHeader w:val="0"/>
+        </w:trPr>
+        <w:tc>
+          <w:tcPr>
+            <w:tcBorders>
+              <w:top w:color="808080" w:space="0" w:sz="4" w:val="single"/>
+              <w:left w:color="808080" w:space="0" w:sz="4" w:val="single"/>
+              <w:bottom w:color="808080" w:space="0" w:sz="4" w:val="single"/>
+              <w:right w:color="808080" w:space="0" w:sz="4" w:val="single"/>
+            </w:tcBorders>
+            <w:tcMar>
+              <w:top w:w="60.0" w:type="dxa"/>
+              <w:left w:w="90.0" w:type="dxa"/>
+              <w:bottom w:w="60.0" w:type="dxa"/>
+              <w:right w:w="90.0" w:type="dxa"/>
+            </w:tcMar>
+          </w:tcPr>
+          <w:p>
+            <w:pPr>
+              <w:jc w:val="center"/>
+              <w:rPr/>
+            </w:pPr>
+            <w:r>
+              <w:rPr>
+                <w:rFonts w:ascii="Calibri" w:cs="Calibri" w:eastAsia="Calibri" w:hAnsi="Calibri"/>
+                <w:b w:val="0"/>
+                <w:bCs w:val="0"/>
+                <w:sz w:val="19"/>
+                <w:szCs w:val="19"/>
+                <w:rtl w:val="0"/>
+              </w:rPr>
+              <w:t xml:space="preserve">1.3</w:t>
+            </w:r>
+            <w:r>
+              <w:rPr>
+                <w:rtl w:val="0"/>
+              </w:rPr>
+            </w:r>
+          </w:p>
+        </w:tc>
+        <w:tc>
+          <w:tcPr>
+            <w:tcBorders>
+              <w:top w:color="808080" w:space="0" w:sz="4" w:val="single"/>
+              <w:left w:color="808080" w:space="0" w:sz="4" w:val="single"/>
+              <w:bottom w:color="808080" w:space="0" w:sz="4" w:val="single"/>
+              <w:right w:color="808080" w:space="0" w:sz="4" w:val="single"/>
+            </w:tcBorders>
+            <w:tcMar>
+              <w:top w:w="60.0" w:type="dxa"/>
+              <w:left w:w="90.0" w:type="dxa"/>
+              <w:bottom w:w="60.0" w:type="dxa"/>
+              <w:right w:w="90.0" w:type="dxa"/>
+            </w:tcMar>
+          </w:tcPr>
+          <w:p>
+            <w:pPr>
+              <w:jc w:val="center"/>
+              <w:rPr/>
+            </w:pPr>
+            <w:r>
+              <w:rPr>
+                <w:rFonts w:ascii="Calibri" w:cs="Calibri" w:eastAsia="Calibri" w:hAnsi="Calibri"/>
+                <w:b w:val="0"/>
+                <w:bCs w:val="0"/>
+                <w:sz w:val="19"/>
+                <w:szCs w:val="19"/>
+                <w:rtl w:val="0"/>
+              </w:rPr>
+              <w:t xml:space="preserve">18/10/2026</w:t>
+            </w:r>
+            <w:r>
+              <w:rPr>
+                <w:rtl w:val="0"/>
+              </w:rPr>
+            </w:r>
+          </w:p>
+        </w:tc>
+        <w:tc>
+          <w:tcPr>
+            <w:tcBorders>
+              <w:top w:color="808080" w:space="0" w:sz="4" w:val="single"/>
+              <w:left w:color="808080" w:space="0" w:sz="4" w:val="single"/>
+              <w:bottom w:color="808080" w:space="0" w:sz="4" w:val="single"/>
+              <w:right w:color="808080" w:space="0" w:sz="4" w:val="single"/>
+            </w:tcBorders>
+            <w:tcMar>
+              <w:top w:w="60.0" w:type="dxa"/>
+              <w:left w:w="90.0" w:type="dxa"/>
+              <w:bottom w:w="60.0" w:type="dxa"/>
+              <w:right w:w="90.0" w:type="dxa"/>
+            </w:tcMar>
+          </w:tcPr>
+          <w:p>
+            <w:pPr>
+              <w:jc w:val="left"/>
+              <w:rPr/>
+            </w:pPr>
+            <w:r>
+              <w:rPr>
+                <w:rFonts w:ascii="Calibri" w:cs="Calibri" w:eastAsia="Calibri" w:hAnsi="Calibri"/>
+                <w:b w:val="0"/>
+                <w:bCs w:val="0"/>
+                <w:sz w:val="19"/>
+                <w:szCs w:val="19"/>
+                <w:rtl w:val="0"/>
+              </w:rPr>
+              <w:t xml:space="preserve">CU-07 actualizado a implementado y aceptado, según la prueba de aceptación T-48. La tarjeta CRC de PantallaHabilidad incorpora la recarga a partir del identificador de la pregunta.</w:t>
             </w:r>
             <w:r>
               <w:rPr>
@@ -10370,6 +10583,20 @@
   <w:style w:type="paragraph" w:styleId="Normal" w:default="1">
     <w:name w:val="normal"/>
   </w:style>
+  <w:style w:type="table" w:styleId="TableNormal" w:default="1">
+    <w:name w:val="TableNormal"/>
+    <w:tblPr>
+      <w:tblCellMar>
+        <w:top w:w="100.0" w:type="dxa"/>
+        <w:left w:w="100.0" w:type="dxa"/>
+        <w:bottom w:w="100.0" w:type="dxa"/>
+        <w:right w:w="100.0" w:type="dxa"/>
+      </w:tblCellMar>
+    </w:tblPr>
+  </w:style>
+  <w:style w:type="paragraph" w:styleId="Normal" w:default="1">
+    <w:name w:val="normal"/>
+  </w:style>
   <w:style w:type="paragraph" w:styleId="Strong">
     <w:name w:val="Strong"/>
     <w:basedOn w:val="Normal"/>
@@ -10600,6 +10827,240 @@
     </w:tblPr>
   </w:style>
   <w:style w:type="table" w:styleId="Table11">
+    <w:basedOn w:val="TableNormal"/>
+    <w:tblPr>
+      <w:tblStyleRowBandSize w:val="1"/>
+      <w:tblStyleColBandSize w:val="1"/>
+      <w:tblCellMar>
+        <w:top w:w="0.0" w:type="dxa"/>
+        <w:left w:w="115.0" w:type="dxa"/>
+        <w:bottom w:w="0.0" w:type="dxa"/>
+        <w:right w:w="115.0" w:type="dxa"/>
+      </w:tblCellMar>
+    </w:tblPr>
+  </w:style>
+  <w:style w:type="table" w:styleId="Table1">
+    <w:basedOn w:val="TableNormal"/>
+    <w:tblPr>
+      <w:tblStyleRowBandSize w:val="1"/>
+      <w:tblStyleColBandSize w:val="1"/>
+      <w:tblCellMar>
+        <w:top w:w="0.0" w:type="dxa"/>
+        <w:left w:w="115.0" w:type="dxa"/>
+        <w:bottom w:w="0.0" w:type="dxa"/>
+        <w:right w:w="115.0" w:type="dxa"/>
+      </w:tblCellMar>
+    </w:tblPr>
+  </w:style>
+  <w:style w:type="table" w:styleId="Table2">
+    <w:basedOn w:val="TableNormal"/>
+    <w:tblPr>
+      <w:tblStyleRowBandSize w:val="1"/>
+      <w:tblStyleColBandSize w:val="1"/>
+      <w:tblCellMar>
+        <w:top w:w="0.0" w:type="dxa"/>
+        <w:left w:w="115.0" w:type="dxa"/>
+        <w:bottom w:w="0.0" w:type="dxa"/>
+        <w:right w:w="115.0" w:type="dxa"/>
+      </w:tblCellMar>
+    </w:tblPr>
+  </w:style>
+  <w:style w:type="table" w:styleId="Table3">
+    <w:basedOn w:val="TableNormal"/>
+    <w:tblPr>
+      <w:tblStyleRowBandSize w:val="1"/>
+      <w:tblStyleColBandSize w:val="1"/>
+      <w:tblCellMar>
+        <w:top w:w="0.0" w:type="dxa"/>
+        <w:left w:w="115.0" w:type="dxa"/>
+        <w:bottom w:w="0.0" w:type="dxa"/>
+        <w:right w:w="115.0" w:type="dxa"/>
+      </w:tblCellMar>
+    </w:tblPr>
+  </w:style>
+  <w:style w:type="table" w:styleId="Table4">
+    <w:basedOn w:val="TableNormal"/>
+    <w:tblPr>
+      <w:tblStyleRowBandSize w:val="1"/>
+      <w:tblStyleColBandSize w:val="1"/>
+      <w:tblCellMar>
+        <w:top w:w="0.0" w:type="dxa"/>
+        <w:left w:w="115.0" w:type="dxa"/>
+        <w:bottom w:w="0.0" w:type="dxa"/>
+        <w:right w:w="115.0" w:type="dxa"/>
+      </w:tblCellMar>
+    </w:tblPr>
+  </w:style>
+  <w:style w:type="table" w:styleId="Table5">
+    <w:basedOn w:val="TableNormal"/>
+    <w:tblPr>
+      <w:tblStyleRowBandSize w:val="1"/>
+      <w:tblStyleColBandSize w:val="1"/>
+      <w:tblCellMar>
+        <w:top w:w="0.0" w:type="dxa"/>
+        <w:left w:w="115.0" w:type="dxa"/>
+        <w:bottom w:w="0.0" w:type="dxa"/>
+        <w:right w:w="115.0" w:type="dxa"/>
+      </w:tblCellMar>
+    </w:tblPr>
+  </w:style>
+  <w:style w:type="table" w:styleId="Table6">
+    <w:basedOn w:val="TableNormal"/>
+    <w:tblPr>
+      <w:tblStyleRowBandSize w:val="1"/>
+      <w:tblStyleColBandSize w:val="1"/>
+      <w:tblCellMar>
+        <w:top w:w="0.0" w:type="dxa"/>
+        <w:left w:w="115.0" w:type="dxa"/>
+        <w:bottom w:w="0.0" w:type="dxa"/>
+        <w:right w:w="115.0" w:type="dxa"/>
+      </w:tblCellMar>
+    </w:tblPr>
+  </w:style>
+  <w:style w:type="table" w:styleId="Table7">
+    <w:basedOn w:val="TableNormal"/>
+    <w:tblPr>
+      <w:tblStyleRowBandSize w:val="1"/>
+      <w:tblStyleColBandSize w:val="1"/>
+      <w:tblCellMar>
+        <w:top w:w="0.0" w:type="dxa"/>
+        <w:left w:w="115.0" w:type="dxa"/>
+        <w:bottom w:w="0.0" w:type="dxa"/>
+        <w:right w:w="115.0" w:type="dxa"/>
+      </w:tblCellMar>
+    </w:tblPr>
+  </w:style>
+  <w:style w:type="table" w:styleId="Table8">
+    <w:basedOn w:val="TableNormal"/>
+    <w:tblPr>
+      <w:tblStyleRowBandSize w:val="1"/>
+      <w:tblStyleColBandSize w:val="1"/>
+      <w:tblCellMar>
+        <w:top w:w="0.0" w:type="dxa"/>
+        <w:left w:w="115.0" w:type="dxa"/>
+        <w:bottom w:w="0.0" w:type="dxa"/>
+        <w:right w:w="115.0" w:type="dxa"/>
+      </w:tblCellMar>
+    </w:tblPr>
+  </w:style>
+  <w:style w:type="table" w:styleId="Table9">
+    <w:basedOn w:val="TableNormal"/>
+    <w:tblPr>
+      <w:tblStyleRowBandSize w:val="1"/>
+      <w:tblStyleColBandSize w:val="1"/>
+      <w:tblCellMar>
+        <w:top w:w="0.0" w:type="dxa"/>
+        <w:left w:w="115.0" w:type="dxa"/>
+        <w:bottom w:w="0.0" w:type="dxa"/>
+        <w:right w:w="115.0" w:type="dxa"/>
+      </w:tblCellMar>
+    </w:tblPr>
+  </w:style>
+  <w:style w:type="table" w:styleId="Table10">
+    <w:basedOn w:val="TableNormal"/>
+    <w:tblPr>
+      <w:tblStyleRowBandSize w:val="1"/>
+      <w:tblStyleColBandSize w:val="1"/>
+      <w:tblCellMar>
+        <w:top w:w="0.0" w:type="dxa"/>
+        <w:left w:w="115.0" w:type="dxa"/>
+        <w:bottom w:w="0.0" w:type="dxa"/>
+        <w:right w:w="115.0" w:type="dxa"/>
+      </w:tblCellMar>
+    </w:tblPr>
+  </w:style>
+  <w:style w:type="table" w:styleId="Table11">
+    <w:basedOn w:val="TableNormal"/>
+    <w:tblPr>
+      <w:tblStyleRowBandSize w:val="1"/>
+      <w:tblStyleColBandSize w:val="1"/>
+      <w:tblCellMar>
+        <w:top w:w="0.0" w:type="dxa"/>
+        <w:left w:w="115.0" w:type="dxa"/>
+        <w:bottom w:w="0.0" w:type="dxa"/>
+        <w:right w:w="115.0" w:type="dxa"/>
+      </w:tblCellMar>
+    </w:tblPr>
+  </w:style>
+  <w:style w:type="table" w:styleId="Table12">
+    <w:basedOn w:val="TableNormal"/>
+    <w:tblPr>
+      <w:tblStyleRowBandSize w:val="1"/>
+      <w:tblStyleColBandSize w:val="1"/>
+      <w:tblCellMar>
+        <w:top w:w="0.0" w:type="dxa"/>
+        <w:left w:w="115.0" w:type="dxa"/>
+        <w:bottom w:w="0.0" w:type="dxa"/>
+        <w:right w:w="115.0" w:type="dxa"/>
+      </w:tblCellMar>
+    </w:tblPr>
+  </w:style>
+  <w:style w:type="table" w:styleId="Table13">
+    <w:basedOn w:val="TableNormal"/>
+    <w:tblPr>
+      <w:tblStyleRowBandSize w:val="1"/>
+      <w:tblStyleColBandSize w:val="1"/>
+      <w:tblCellMar>
+        <w:top w:w="0.0" w:type="dxa"/>
+        <w:left w:w="115.0" w:type="dxa"/>
+        <w:bottom w:w="0.0" w:type="dxa"/>
+        <w:right w:w="115.0" w:type="dxa"/>
+      </w:tblCellMar>
+    </w:tblPr>
+  </w:style>
+  <w:style w:type="table" w:styleId="Table14">
+    <w:basedOn w:val="TableNormal"/>
+    <w:tblPr>
+      <w:tblStyleRowBandSize w:val="1"/>
+      <w:tblStyleColBandSize w:val="1"/>
+      <w:tblCellMar>
+        <w:top w:w="0.0" w:type="dxa"/>
+        <w:left w:w="115.0" w:type="dxa"/>
+        <w:bottom w:w="0.0" w:type="dxa"/>
+        <w:right w:w="115.0" w:type="dxa"/>
+      </w:tblCellMar>
+    </w:tblPr>
+  </w:style>
+  <w:style w:type="table" w:styleId="Table15">
+    <w:basedOn w:val="TableNormal"/>
+    <w:tblPr>
+      <w:tblStyleRowBandSize w:val="1"/>
+      <w:tblStyleColBandSize w:val="1"/>
+      <w:tblCellMar>
+        <w:top w:w="0.0" w:type="dxa"/>
+        <w:left w:w="115.0" w:type="dxa"/>
+        <w:bottom w:w="0.0" w:type="dxa"/>
+        <w:right w:w="115.0" w:type="dxa"/>
+      </w:tblCellMar>
+    </w:tblPr>
+  </w:style>
+  <w:style w:type="table" w:styleId="Table16">
+    <w:basedOn w:val="TableNormal"/>
+    <w:tblPr>
+      <w:tblStyleRowBandSize w:val="1"/>
+      <w:tblStyleColBandSize w:val="1"/>
+      <w:tblCellMar>
+        <w:top w:w="0.0" w:type="dxa"/>
+        <w:left w:w="115.0" w:type="dxa"/>
+        <w:bottom w:w="0.0" w:type="dxa"/>
+        <w:right w:w="115.0" w:type="dxa"/>
+      </w:tblCellMar>
+    </w:tblPr>
+  </w:style>
+  <w:style w:type="table" w:styleId="Table17">
+    <w:basedOn w:val="TableNormal"/>
+    <w:tblPr>
+      <w:tblStyleRowBandSize w:val="1"/>
+      <w:tblStyleColBandSize w:val="1"/>
+      <w:tblCellMar>
+        <w:top w:w="0.0" w:type="dxa"/>
+        <w:left w:w="115.0" w:type="dxa"/>
+        <w:bottom w:w="0.0" w:type="dxa"/>
+        <w:right w:w="115.0" w:type="dxa"/>
+      </w:tblCellMar>
+    </w:tblPr>
+  </w:style>
+  <w:style w:type="table" w:styleId="Table18">
     <w:basedOn w:val="TableNormal"/>
     <w:tblPr>
       <w:tblStyleRowBandSize w:val="1"/>
@@ -11190,7 +11651,7 @@
 
 <file path=customXML/item1.xml><?xml version="1.0" encoding="utf-8"?>
 <go:gDocsCustomXmlDataStorage xmlns:go="http://customooxmlschemas.google.com/" xmlns:r="http://schemas.openxmlformats.org/officeDocument/2006/relationships" uri="GoogleDocsCustomDataVersion2">
-  <go:docsCustomData xmlns:go="http://customooxmlschemas.google.com/" roundtripDataSignature="AMtx7miNLg3V5rulRM3HAHuxhZ+V43LMdw==">CgMxLjA4AHIhMUhLWlZDTmRjaVF5aWR4dmFHeVdHQ0FjQURXcFBrQ2FN</go:docsCustomData>
+  <go:docsCustomData xmlns:go="http://customooxmlschemas.google.com/" roundtripDataSignature="AMtx7mi4iRCnYiBHXHXpiPKHpQ8PZnm/0g==">CgMxLjA4AHIhMTdUWXpsdWJyNm15YXJ0US1fZG1iM3BRYVlLUVZnZHVF</go:docsCustomData>
 </go:gDocsCustomXmlDataStorage>
 </file>
 

</xml_diff>